<commit_message>
docs: update compiled word documents with refined OMR parameters
</commit_message>
<xml_diff>
--- a/Bao_cao_Chuong_3.docx
+++ b/Bao_cao_Chuong_3.docx
@@ -4344,14 +4344,14 @@
           <w:color w:val="B42828"/>
           <w:sz w:val="20"/>
         </w:rPr>
-        <w:t>filled_ratio &gt;= 0.22</w:t>
+        <w:t>filled_ratio &gt;= 0.30</w:t>
       </w:r>
       <w:r>
         <w:rPr>
           <w:rFonts w:ascii="Times New Roman" w:hAnsi="Times New Roman"/>
           <w:sz w:val="26"/>
         </w:rPr>
-        <w:t xml:space="preserve"> (22% pixel tô đen).</w:t>
+        <w:t xml:space="preserve"> (30% pixel tô đen).</w:t>
       </w:r>
     </w:p>
     <w:p>
@@ -4391,7 +4391,7 @@
           <w:rFonts w:ascii="Times New Roman" w:hAnsi="Times New Roman"/>
           <w:sz w:val="26"/>
         </w:rPr>
-        <w:t xml:space="preserve"> So sánh chênh lệch tỷ lệ giữa ô cao nhất và ô thứ hai. Nếu chênh lệch &gt; 0.20, chọn ô cao nhất. Ngược lại, ghi nhận là "chọn nhiều đáp án" (ví dụ: "AB").</w:t>
+        <w:t xml:space="preserve"> So sánh chênh lệch tỷ lệ giữa ô cao nhất và ô thứ hai. Nếu chênh lệch &gt; 0.15, chọn ô cao nhất. Ngược lại, ghi nhận là "chọn nhiều đáp án" (ví dụ: "AB").</w:t>
       </w:r>
     </w:p>
     <w:p>

</xml_diff>